<commit_message>
Añadido link al github en la memoria
</commit_message>
<xml_diff>
--- a/Memoria-48801026V.docx
+++ b/Memoria-48801026V.docx
@@ -104,6 +104,33 @@
           </w14:textOutline>
         </w:rPr>
         <w:t>– 48801026V</w:t>
+      </w:r>
+    </w:p>
+    <w:p>
+      <w:r>
+        <w:t>En</w:t>
+      </w:r>
+      <w:r>
+        <w:t xml:space="preserve">lace al </w:t>
+      </w:r>
+      <w:proofErr w:type="spellStart"/>
+      <w:proofErr w:type="gramStart"/>
+      <w:r>
+        <w:t>github</w:t>
+      </w:r>
+      <w:proofErr w:type="spellEnd"/>
+      <w:r>
+        <w:t xml:space="preserve"> :</w:t>
+      </w:r>
+      <w:proofErr w:type="gramEnd"/>
+      <w:r>
+        <w:t xml:space="preserve"> </w:t>
+      </w:r>
+      <w:r>
+        <w:t>https://github.com/mmc225-ua/tar-practica1-2526/</w:t>
+      </w:r>
+      <w:r>
+        <w:t xml:space="preserve"> </w:t>
       </w:r>
     </w:p>
     <w:sdt>
@@ -3010,9 +3037,14 @@
       </w:pPr>
       <w:bookmarkStart w:id="2" w:name="_Toc223888521"/>
       <w:r>
-        <w:t>Pregunta 1 :</w:t>
+        <w:t xml:space="preserve">Pregunta </w:t>
+      </w:r>
+      <w:proofErr w:type="gramStart"/>
+      <w:r>
+        <w:t>1 :</w:t>
       </w:r>
       <w:bookmarkEnd w:id="2"/>
+      <w:proofErr w:type="gramEnd"/>
       <w:r>
         <w:t xml:space="preserve"> </w:t>
       </w:r>
@@ -3318,8 +3350,13 @@
         <w:t>String</w:t>
       </w:r>
       <w:proofErr w:type="spellEnd"/>
-      <w:r>
-        <w:t xml:space="preserve">” , entonces los mensajes son cadenas de texto. Mientras solo estaba el taller activo, el </w:t>
+      <w:proofErr w:type="gramStart"/>
+      <w:r>
+        <w:t>” ,</w:t>
+      </w:r>
+      <w:proofErr w:type="gramEnd"/>
+      <w:r>
+        <w:t xml:space="preserve"> entonces los mensajes son cadenas de texto. Mientras solo estaba el taller activo, el </w:t>
       </w:r>
       <w:proofErr w:type="spellStart"/>
       <w:r>
@@ -3327,7 +3364,15 @@
       </w:r>
       <w:proofErr w:type="spellEnd"/>
       <w:r>
-        <w:t xml:space="preserve"> tenía : </w:t>
+        <w:t xml:space="preserve"> </w:t>
+      </w:r>
+      <w:proofErr w:type="gramStart"/>
+      <w:r>
+        <w:t>tenía :</w:t>
+      </w:r>
+      <w:proofErr w:type="gramEnd"/>
+      <w:r>
+        <w:t xml:space="preserve"> </w:t>
       </w:r>
     </w:p>
     <w:p>
@@ -3345,7 +3390,21 @@
         <w:rPr>
           <w:lang w:val="en-US"/>
         </w:rPr>
-        <w:t>Publisher count : 1 (</w:t>
+        <w:t xml:space="preserve">Publisher </w:t>
+      </w:r>
+      <w:proofErr w:type="gramStart"/>
+      <w:r>
+        <w:rPr>
+          <w:lang w:val="en-US"/>
+        </w:rPr>
+        <w:t>count :</w:t>
+      </w:r>
+      <w:proofErr w:type="gramEnd"/>
+      <w:r>
+        <w:rPr>
+          <w:lang w:val="en-US"/>
+        </w:rPr>
+        <w:t xml:space="preserve"> 1 (</w:t>
       </w:r>
       <w:proofErr w:type="spellStart"/>
       <w:r>
@@ -3431,7 +3490,15 @@
         <w:t xml:space="preserve"> –once) pude ve</w:t>
       </w:r>
       <w:r>
-        <w:t>r un ejemplo real del mensaje : “data: ‘</w:t>
+        <w:t xml:space="preserve">r un ejemplo real del </w:t>
+      </w:r>
+      <w:proofErr w:type="gramStart"/>
+      <w:r>
+        <w:t>mensaje :</w:t>
+      </w:r>
+      <w:proofErr w:type="gramEnd"/>
+      <w:r>
+        <w:t xml:space="preserve"> “data: ‘</w:t>
       </w:r>
       <w:proofErr w:type="spellStart"/>
       <w:r>
@@ -4005,12 +4072,17 @@
         <w:t xml:space="preserve"> 3 7”, el servidor recibe una </w:t>
       </w:r>
       <w:proofErr w:type="spellStart"/>
+      <w:proofErr w:type="gramStart"/>
       <w:r>
         <w:t>request</w:t>
       </w:r>
       <w:proofErr w:type="spellEnd"/>
       <w:r>
-        <w:t xml:space="preserve"> , que se ve en consola como “</w:t>
+        <w:t xml:space="preserve"> ,</w:t>
+      </w:r>
+      <w:proofErr w:type="gramEnd"/>
+      <w:r>
+        <w:t xml:space="preserve"> que se ve en consola como “</w:t>
       </w:r>
       <w:proofErr w:type="spellStart"/>
       <w:r>
@@ -4091,7 +4163,23 @@
           <w:b/>
           <w:bCs/>
         </w:rPr>
-        <w:t xml:space="preserve">Al lanzar el servidor y a continuación ejecutar el comando:ros2 </w:t>
+        <w:t xml:space="preserve">Al lanzar el servidor y a continuación ejecutar el </w:t>
+      </w:r>
+      <w:proofErr w:type="gramStart"/>
+      <w:r>
+        <w:rPr>
+          <w:b/>
+          <w:bCs/>
+        </w:rPr>
+        <w:t>comando:ros</w:t>
+      </w:r>
+      <w:proofErr w:type="gramEnd"/>
+      <w:r>
+        <w:rPr>
+          <w:b/>
+          <w:bCs/>
+        </w:rPr>
+        <w:t xml:space="preserve">2 </w:t>
       </w:r>
       <w:proofErr w:type="spellStart"/>
       <w:r>
@@ -4160,7 +4248,15 @@
       </w:r>
       <w:proofErr w:type="spellEnd"/>
       <w:r>
-        <w:t xml:space="preserve">” me aparecen estos servicios : </w:t>
+        <w:t xml:space="preserve">” me aparecen estos </w:t>
+      </w:r>
+      <w:proofErr w:type="gramStart"/>
+      <w:r>
+        <w:t>servicios :</w:t>
+      </w:r>
+      <w:proofErr w:type="gramEnd"/>
+      <w:r>
+        <w:t xml:space="preserve"> </w:t>
       </w:r>
     </w:p>
     <w:p>
@@ -4246,8 +4342,13 @@
         <w:t>add_two_ints</w:t>
       </w:r>
       <w:proofErr w:type="spellEnd"/>
-      <w:r>
-        <w:t xml:space="preserve">” , esperar peticiones, recibir a y b, calcular </w:t>
+      <w:proofErr w:type="gramStart"/>
+      <w:r>
+        <w:t>” ,</w:t>
+      </w:r>
+      <w:proofErr w:type="gramEnd"/>
+      <w:r>
+        <w:t xml:space="preserve"> esperar peticiones, recibir a y b, calcular </w:t>
       </w:r>
       <w:proofErr w:type="spellStart"/>
       <w:r>
@@ -4631,11 +4732,19 @@
       </w:r>
       <w:proofErr w:type="spellStart"/>
       <w:r>
-        <w:t>sercicio_suma</w:t>
-      </w:r>
-      <w:proofErr w:type="spellEnd"/>
-      <w:r>
-        <w:t xml:space="preserve"> : </w:t>
+        <w:t>sercicio_</w:t>
+      </w:r>
+      <w:proofErr w:type="gramStart"/>
+      <w:r>
+        <w:t>suma</w:t>
+      </w:r>
+      <w:proofErr w:type="spellEnd"/>
+      <w:r>
+        <w:t xml:space="preserve"> :</w:t>
+      </w:r>
+      <w:proofErr w:type="gramEnd"/>
+      <w:r>
+        <w:t xml:space="preserve"> </w:t>
       </w:r>
     </w:p>
     <w:p>
@@ -4756,9 +4865,14 @@
       </w:pPr>
       <w:bookmarkStart w:id="16" w:name="_Toc223888535"/>
       <w:r>
-        <w:t>Pregunta 9 :</w:t>
+        <w:t xml:space="preserve">Pregunta </w:t>
+      </w:r>
+      <w:proofErr w:type="gramStart"/>
+      <w:r>
+        <w:t>9 :</w:t>
       </w:r>
       <w:bookmarkEnd w:id="16"/>
+      <w:proofErr w:type="gramEnd"/>
       <w:r>
         <w:t xml:space="preserve"> </w:t>
       </w:r>
@@ -4811,6 +4925,7 @@
       <w:r>
         <w:t xml:space="preserve">Pregunta </w:t>
       </w:r>
+      <w:proofErr w:type="gramStart"/>
       <w:r>
         <w:t>10</w:t>
       </w:r>
@@ -4818,6 +4933,7 @@
         <w:t xml:space="preserve"> :</w:t>
       </w:r>
       <w:bookmarkEnd w:id="17"/>
+      <w:proofErr w:type="gramEnd"/>
       <w:r>
         <w:t xml:space="preserve"> </w:t>
       </w:r>
@@ -4927,15 +5043,20 @@
       </w:pPr>
       <w:bookmarkStart w:id="18" w:name="_Toc223888537"/>
       <w:r>
-        <w:t>Pregunta 1</w:t>
-      </w:r>
+        <w:t xml:space="preserve">Pregunta </w:t>
+      </w:r>
+      <w:proofErr w:type="gramStart"/>
       <w:r>
         <w:t>1</w:t>
       </w:r>
       <w:r>
+        <w:t>1</w:t>
+      </w:r>
+      <w:r>
         <w:t xml:space="preserve"> :</w:t>
       </w:r>
       <w:bookmarkEnd w:id="18"/>
+      <w:proofErr w:type="gramEnd"/>
       <w:r>
         <w:t xml:space="preserve"> </w:t>
       </w:r>
@@ -5127,7 +5248,23 @@
           <w:b/>
           <w:bCs/>
         </w:rPr>
-        <w:t xml:space="preserve">Intenta modificar la constante nombre, del mensaje, modificando el código del nodo </w:t>
+        <w:t xml:space="preserve">Intenta modificar </w:t>
+      </w:r>
+      <w:proofErr w:type="gramStart"/>
+      <w:r>
+        <w:rPr>
+          <w:b/>
+          <w:bCs/>
+        </w:rPr>
+        <w:t>la constante nombre</w:t>
+      </w:r>
+      <w:proofErr w:type="gramEnd"/>
+      <w:r>
+        <w:rPr>
+          <w:b/>
+          <w:bCs/>
+        </w:rPr>
+        <w:t xml:space="preserve">, del mensaje, modificando el código del nodo </w:t>
       </w:r>
       <w:proofErr w:type="spellStart"/>
       <w:r>
@@ -5295,9 +5432,14 @@
       </w:pPr>
       <w:bookmarkStart w:id="22" w:name="_Toc223888541"/>
       <w:r>
-        <w:t>Ejercicio 1 :</w:t>
+        <w:t xml:space="preserve">Ejercicio </w:t>
+      </w:r>
+      <w:proofErr w:type="gramStart"/>
+      <w:r>
+        <w:t>1 :</w:t>
       </w:r>
       <w:bookmarkEnd w:id="22"/>
+      <w:proofErr w:type="gramEnd"/>
       <w:r>
         <w:t xml:space="preserve"> </w:t>
       </w:r>
@@ -5347,16 +5489,29 @@
       </w:pPr>
       <w:bookmarkStart w:id="23" w:name="_Toc223888542"/>
       <w:r>
-        <w:t>Ejercicio 2 :</w:t>
+        <w:t xml:space="preserve">Ejercicio </w:t>
+      </w:r>
+      <w:proofErr w:type="gramStart"/>
+      <w:r>
+        <w:t>2 :</w:t>
       </w:r>
       <w:bookmarkEnd w:id="23"/>
+      <w:proofErr w:type="gramEnd"/>
       <w:r>
         <w:t xml:space="preserve"> </w:t>
       </w:r>
     </w:p>
     <w:p>
       <w:r>
-        <w:t xml:space="preserve">En la Terminal 1 : </w:t>
+        <w:t xml:space="preserve">En la Terminal </w:t>
+      </w:r>
+      <w:proofErr w:type="gramStart"/>
+      <w:r>
+        <w:t>1 :</w:t>
+      </w:r>
+      <w:proofErr w:type="gramEnd"/>
+      <w:r>
+        <w:t xml:space="preserve"> </w:t>
       </w:r>
     </w:p>
     <w:p>
@@ -5440,7 +5595,15 @@
     <w:p>
       <w:r>
         <w:lastRenderedPageBreak/>
-        <w:t xml:space="preserve">En la Terminal 2 : </w:t>
+        <w:t xml:space="preserve">En la Terminal </w:t>
+      </w:r>
+      <w:proofErr w:type="gramStart"/>
+      <w:r>
+        <w:t>2 :</w:t>
+      </w:r>
+      <w:proofErr w:type="gramEnd"/>
+      <w:r>
+        <w:t xml:space="preserve"> </w:t>
       </w:r>
     </w:p>
     <w:p>
@@ -5539,10 +5702,18 @@
       </w:r>
       <w:proofErr w:type="spellEnd"/>
       <w:r>
-        <w:t>/P2pkgMensaje</w:t>
-      </w:r>
-      <w:r>
-        <w:t xml:space="preserve"> . He añadido </w:t>
+        <w:t>/P2</w:t>
+      </w:r>
+      <w:proofErr w:type="gramStart"/>
+      <w:r>
+        <w:t>pkgMensaje</w:t>
+      </w:r>
+      <w:r>
+        <w:t xml:space="preserve"> .</w:t>
+      </w:r>
+      <w:proofErr w:type="gramEnd"/>
+      <w:r>
+        <w:t xml:space="preserve"> He añadido </w:t>
       </w:r>
       <w:r>
         <w:t xml:space="preserve">la dependencia a interfaz en package.xml y </w:t>
@@ -5779,6 +5950,7 @@
         <w:t xml:space="preserve"> con el parámetro </w:t>
       </w:r>
       <w:proofErr w:type="spellStart"/>
+      <w:proofErr w:type="gramStart"/>
       <w:r>
         <w:t>name</w:t>
       </w:r>
@@ -5787,7 +5959,11 @@
         <w:t xml:space="preserve"> </w:t>
       </w:r>
       <w:r>
-        <w:t xml:space="preserve">, </w:t>
+        <w:t>,</w:t>
+      </w:r>
+      <w:proofErr w:type="gramEnd"/>
+      <w:r>
+        <w:t xml:space="preserve"> </w:t>
       </w:r>
       <w:r>
         <w:t>luego se ven esos nombres en los logs al ejecutarlo.</w:t>
@@ -5965,9 +6141,14 @@
       </w:r>
       <w:proofErr w:type="spellStart"/>
       <w:r>
-        <w:t>goal_handle.succeed</w:t>
-      </w:r>
-      <w:proofErr w:type="spellEnd"/>
+        <w:t>goal_</w:t>
+      </w:r>
+      <w:proofErr w:type="gramStart"/>
+      <w:r>
+        <w:t>handle.succeed</w:t>
+      </w:r>
+      <w:proofErr w:type="spellEnd"/>
+      <w:proofErr w:type="gramEnd"/>
       <w:r>
         <w:t xml:space="preserve">(), que indica que el objetivo terminó correctamente antes de devolver el </w:t>
       </w:r>
@@ -6741,7 +6922,15 @@
       </w:r>
       <w:proofErr w:type="spellEnd"/>
       <w:r>
-        <w:t xml:space="preserve"> p2pkg launch_ejercicio3.py numero:=12 (aparece </w:t>
+        <w:t xml:space="preserve"> p2pkg launch_ejercicio3.py </w:t>
+      </w:r>
+      <w:proofErr w:type="gramStart"/>
+      <w:r>
+        <w:t>numero:=</w:t>
+      </w:r>
+      <w:proofErr w:type="gramEnd"/>
+      <w:r>
+        <w:t xml:space="preserve">12 (aparece </w:t>
       </w:r>
       <w:proofErr w:type="spellStart"/>
       <w:r>
@@ -6749,7 +6938,15 @@
       </w:r>
       <w:proofErr w:type="spellEnd"/>
       <w:r>
-        <w:t xml:space="preserve">=12). Además </w:t>
+        <w:t xml:space="preserve">=12). </w:t>
+      </w:r>
+      <w:proofErr w:type="gramStart"/>
+      <w:r>
+        <w:t>Además</w:t>
+      </w:r>
+      <w:proofErr w:type="gramEnd"/>
+      <w:r>
+        <w:t xml:space="preserve"> </w:t>
       </w:r>
       <w:r>
         <w:t xml:space="preserve">está verificado </w:t>
@@ -7231,7 +7428,15 @@
       </w:r>
       <w:proofErr w:type="spellEnd"/>
       <w:r>
-        <w:t xml:space="preserve">/topic_ejercicio2. Además el parámetro </w:t>
+        <w:t xml:space="preserve">/topic_ejercicio2. </w:t>
+      </w:r>
+      <w:proofErr w:type="gramStart"/>
+      <w:r>
+        <w:t>Además</w:t>
+      </w:r>
+      <w:proofErr w:type="gramEnd"/>
+      <w:r>
+        <w:t xml:space="preserve"> el parámetro </w:t>
       </w:r>
       <w:proofErr w:type="spellStart"/>
       <w:r>
@@ -7892,7 +8097,15 @@
     </w:p>
     <w:p>
       <w:r>
-        <w:t xml:space="preserve">En la primera terminal : </w:t>
+        <w:t xml:space="preserve">En la primera </w:t>
+      </w:r>
+      <w:proofErr w:type="gramStart"/>
+      <w:r>
+        <w:t>terminal :</w:t>
+      </w:r>
+      <w:proofErr w:type="gramEnd"/>
+      <w:r>
+        <w:t xml:space="preserve"> </w:t>
       </w:r>
     </w:p>
     <w:p>
@@ -7936,7 +8149,15 @@
     </w:p>
     <w:p>
       <w:r>
-        <w:t xml:space="preserve">En la segunda : </w:t>
+        <w:t xml:space="preserve">En la </w:t>
+      </w:r>
+      <w:proofErr w:type="gramStart"/>
+      <w:r>
+        <w:t>segunda :</w:t>
+      </w:r>
+      <w:proofErr w:type="gramEnd"/>
+      <w:r>
+        <w:t xml:space="preserve"> </w:t>
       </w:r>
     </w:p>
     <w:p>
@@ -7980,7 +8201,15 @@
     </w:p>
     <w:p>
       <w:r>
-        <w:t xml:space="preserve">Y en la tercera : </w:t>
+        <w:t xml:space="preserve">Y en la </w:t>
+      </w:r>
+      <w:proofErr w:type="gramStart"/>
+      <w:r>
+        <w:t>tercera :</w:t>
+      </w:r>
+      <w:proofErr w:type="gramEnd"/>
+      <w:r>
+        <w:t xml:space="preserve"> </w:t>
       </w:r>
     </w:p>
     <w:p>
@@ -8058,7 +8287,23 @@
       </w:r>
       <w:proofErr w:type="spellEnd"/>
       <w:r>
-        <w:t xml:space="preserve"> -p orden:=...). Además </w:t>
+        <w:t xml:space="preserve"> -p </w:t>
+      </w:r>
+      <w:proofErr w:type="gramStart"/>
+      <w:r>
+        <w:t>orden:=</w:t>
+      </w:r>
+      <w:proofErr w:type="gramEnd"/>
+      <w:r>
+        <w:t xml:space="preserve">...). </w:t>
+      </w:r>
+      <w:proofErr w:type="gramStart"/>
+      <w:r>
+        <w:t>Además</w:t>
+      </w:r>
+      <w:proofErr w:type="gramEnd"/>
+      <w:r>
+        <w:t xml:space="preserve"> </w:t>
       </w:r>
       <w:r>
         <w:t>he añadido</w:t>
@@ -8112,10 +8357,18 @@
       </w:r>
       <w:proofErr w:type="spellEnd"/>
       <w:r>
-        <w:t xml:space="preserve">). Para que ROS2 pudiera ejecutarlo, </w:t>
-      </w:r>
-      <w:r>
-        <w:t xml:space="preserve"> he registrado</w:t>
+        <w:t xml:space="preserve">). Para que ROS2 pudiera </w:t>
+      </w:r>
+      <w:proofErr w:type="gramStart"/>
+      <w:r>
+        <w:t xml:space="preserve">ejecutarlo, </w:t>
+      </w:r>
+      <w:r>
+        <w:t xml:space="preserve"> he</w:t>
+      </w:r>
+      <w:proofErr w:type="gramEnd"/>
+      <w:r>
+        <w:t xml:space="preserve"> registrado</w:t>
       </w:r>
       <w:r>
         <w:t xml:space="preserve"> el ejecutable en el setup.py (entrada en </w:t>

</xml_diff>